<commit_message>
brand: Safeharbor brand package (harbor-light mark) + name decision
- Mark: gold lamp + signal arcs on a light-post inside the harbor bowl,
  built from 8westit.com palette tokens; Inter wordmarks as vector paths
- Assets: horizontal/square lockups (dark+light), app tile, favicon.svg/ico,
  mark-only SVG, PNG rasters, canonical tokens.json
- tools/build_brand.py generates SVG masters; tools/rasterize_brand.py
  renders PNG/ICO via resvg
- Planning doc v1.1: Safeharbor selected ('Every client issue, safely ashore.')
</commit_message>
<xml_diff>
--- a/docs/8_West_Helpdesk_App_Idea_and_Phased_Rollout.docx
+++ b/docs/8_West_Helpdesk_App_Idea_and_Phased_Rollout.docx
@@ -342,7 +342,7 @@
                 <w:color w:val="2D8CFF"/>
                 <w:sz w:val="18"/>
               </w:rPr>
-              <w:t xml:space="preserve">WORKING NAME   </w:t>
+              <w:t xml:space="preserve">CHOSEN NAME   </w:t>
             </w:r>
           </w:p>
         </w:tc>
@@ -359,7 +359,7 @@
                 <w:color w:val="1A2B45"/>
                 <w:sz w:val="19"/>
               </w:rPr>
-              <w:t>“Waymark” (top candidate of 20 — see Section 3)</w:t>
+              <w:t>Safeharbor — “Every client issue, safely ashore.” (Section 3)</w:t>
             </w:r>
           </w:p>
         </w:tc>
@@ -437,7 +437,7 @@
                 <w:color w:val="1A2B45"/>
                 <w:sz w:val="19"/>
               </w:rPr>
-              <w:t>Draft v1.0 — planning phase, no code yet</w:t>
+              <w:t>v1.1 — name selected; Phase 0 underway</w:t>
             </w:r>
           </w:p>
         </w:tc>
@@ -3692,7 +3692,7 @@
                 <w:color w:val="12345F"/>
                 <w:sz w:val="18"/>
               </w:rPr>
-              <w:t xml:space="preserve">Safeharbor  </w:t>
+              <w:t xml:space="preserve">Safeharbor  ★  </w:t>
             </w:r>
             <w:r>
               <w:rPr>
@@ -3753,7 +3753,7 @@
                 <w:color w:val="1A2B45"/>
                 <w:sz w:val="18"/>
               </w:rPr>
-              <w:t>The destination all support aims for; strongest “resolution” connotation.</w:t>
+              <w:t>The destination all support aims for; strongest “resolution” connotation. ★ SELECTED — July 21, 2026.</w:t>
             </w:r>
           </w:p>
         </w:tc>
@@ -4840,13 +4840,12 @@
           <w:color w:val="12345F"/>
           <w:sz w:val="26"/>
         </w:rPr>
-        <w:t>3.2  Recommendation — top three</w:t>
+        <w:t>3.2  Decision</w:t>
       </w:r>
     </w:p>
     <w:p>
       <w:pPr>
-        <w:pStyle w:val="ListBullet"/>
-        <w:spacing w:after="60" w:line="276" w:lineRule="auto"/>
+        <w:spacing w:after="40" w:line="283" w:lineRule="auto"/>
       </w:pPr>
       <w:r>
         <w:rPr>
@@ -4856,8 +4855,28 @@
           <w:color w:val="12345F"/>
           <w:sz w:val="21"/>
         </w:rPr>
-        <w:t xml:space="preserve">1. Waymark (recommended). </w:t>
+        <w:t xml:space="preserve">Selected July 21, 2026: </w:t>
       </w:r>
+    </w:p>
+    <w:p>
+      <w:pPr>
+        <w:spacing w:after="120" w:line="283" w:lineRule="auto"/>
+      </w:pPr>
+      <w:r>
+        <w:rPr>
+          <w:rFonts w:ascii="Inter" w:hAnsi="Inter"/>
+          <w:b/>
+          <w:i w:val="0"/>
+          <w:color w:val="0B2448"/>
+          <w:sz w:val="24"/>
+        </w:rPr>
+        <w:t xml:space="preserve">Safeharbor — “Every client issue, safely ashore.”  </w:t>
+      </w:r>
+    </w:p>
+    <w:p>
+      <w:pPr>
+        <w:spacing w:after="120" w:line="283" w:lineRule="auto"/>
+      </w:pPr>
       <w:r>
         <w:rPr>
           <w:rFonts w:ascii="Inter" w:hAnsi="Inter"/>
@@ -4866,59 +4885,7 @@
           <w:color w:val="1A2B45"/>
           <w:sz w:val="21"/>
         </w:rPr>
-        <w:t>The most disciplined family member: same -mark suffix as Coastmark, same “marker” concept as Milepost, and the metaphor is perfect — a waymark keeps travelers on course, which is exactly what a help desk does for issues. Short, spellable, pronounceable, and the .com is likely acquirable (verify).</w:t>
-      </w:r>
-    </w:p>
-    <w:p>
-      <w:pPr>
-        <w:pStyle w:val="ListBullet"/>
-        <w:spacing w:after="60" w:line="276" w:lineRule="auto"/>
-      </w:pPr>
-      <w:r>
-        <w:rPr>
-          <w:rFonts w:ascii="Inter" w:hAnsi="Inter"/>
-          <w:b/>
-          <w:i w:val="0"/>
-          <w:color w:val="12345F"/>
-          <w:sz w:val="21"/>
-        </w:rPr>
-        <w:t xml:space="preserve">2. Lightkeeper. </w:t>
-      </w:r>
-      <w:r>
-        <w:rPr>
-          <w:rFonts w:ascii="Inter" w:hAnsi="Inter"/>
-          <w:b w:val="0"/>
-          <w:i w:val="0"/>
-          <w:color w:val="1A2B45"/>
-          <w:sz w:val="21"/>
-        </w:rPr>
-        <w:t>The best story: the keeper keeps the lights burning so no ship is lost — literally the MSP’s promise to clients. Slightly longer; works beautifully in copy (“your clients’ lightkeeper”).</w:t>
-      </w:r>
-    </w:p>
-    <w:p>
-      <w:pPr>
-        <w:pStyle w:val="ListBullet"/>
-        <w:spacing w:after="60" w:line="276" w:lineRule="auto"/>
-      </w:pPr>
-      <w:r>
-        <w:rPr>
-          <w:rFonts w:ascii="Inter" w:hAnsi="Inter"/>
-          <w:b/>
-          <w:i w:val="0"/>
-          <w:color w:val="12345F"/>
-          <w:sz w:val="21"/>
-        </w:rPr>
-        <w:t xml:space="preserve">3. Lamplight. </w:t>
-      </w:r>
-      <w:r>
-        <w:rPr>
-          <w:rFonts w:ascii="Inter" w:hAnsi="Inter"/>
-          <w:b w:val="0"/>
-          <w:i w:val="0"/>
-          <w:color w:val="1A2B45"/>
-          <w:sz w:val="21"/>
-        </w:rPr>
-        <w:t>The most ownable visually: the brand’s gold accent is a lamplight on navy. Warmest and friendliest; least nautical-literal.</w:t>
+        <w:t>Safeharbor carries the strongest resolution metaphor in the family: the harbor is where every voyage ends safely — which is precisely the job of a help desk. It pairs naturally with Coastmark (both coastal), gives the product an instantly understood promise, and inspired the brand mark already produced: a gold harbor light radiating over the sheltering harbor bowl (see the brand/ directory in this repository). Shortlist honored: Waymark (most disciplined family fit), Lightkeeper (best story), Lamplight (most visual).</w:t>
       </w:r>
     </w:p>
     <w:p>
@@ -4933,7 +4900,7 @@
           <w:color w:val="51627C"/>
           <w:sz w:val="21"/>
         </w:rPr>
-        <w:t>Working name used elsewhere in this document: Waymark.</w:t>
+        <w:t>The name Safeharbor is used throughout this document and the product. Trademark/domain validation (3.3) applies to Safeharbor as the final candidate.</w:t>
       </w:r>
     </w:p>
     <w:p>
@@ -7262,7 +7229,7 @@
           <w:color w:val="1A2B45"/>
           <w:sz w:val="21"/>
         </w:rPr>
-        <w:t>For MSPs of 1–25 technicians who live in the ticket queue all day, Waymark is the help desk in the 8 West IT suite that turns every client signal — email, portal, chat, or Milepost alert — into a resolved, invoiced outcome with the fewest clicks in the industry. Unlike ConnectWise and Autotask, it is fast, quiet, and learnable in an afternoon. Unlike Syncro and Atera, it does not sacrifice SLA, contract, or reporting depth. Unlike HaloPSA, it needs no dedicated admin and no minimum seat count.</w:t>
+        <w:t>For MSPs of 1–25 technicians who live in the ticket queue all day, Safeharbor is the help desk in the 8 West IT suite that turns every client signal — email, portal, chat, or Milepost alert — into a resolved, invoiced outcome with the fewest clicks in the industry. Unlike ConnectWise and Autotask, it is fast, quiet, and learnable in an afternoon. Unlike Syncro and Atera, it does not sacrifice SLA, contract, or reporting depth. Unlike HaloPSA, it needs no dedicated admin and no minimum seat count.</w:t>
       </w:r>
     </w:p>
     <w:p>
@@ -8920,7 +8887,7 @@
           <w:color w:val="12345F"/>
           <w:sz w:val="21"/>
         </w:rPr>
-        <w:t xml:space="preserve">Milepost → Waymark. </w:t>
+        <w:t xml:space="preserve">Milepost → Safeharbor. </w:t>
       </w:r>
       <w:r>
         <w:rPr>
@@ -8946,7 +8913,7 @@
           <w:color w:val="12345F"/>
           <w:sz w:val="21"/>
         </w:rPr>
-        <w:t xml:space="preserve">Waymark → Coastmark. </w:t>
+        <w:t xml:space="preserve">Safeharbor → Coastmark. </w:t>
       </w:r>
       <w:r>
         <w:rPr>
@@ -8982,7 +8949,7 @@
           <w:color w:val="1A2B45"/>
           <w:sz w:val="21"/>
         </w:rPr>
-        <w:t>Suite SSO and a shared client graph: a client created once exists everywhere — devices in Milepost, invoices in Coastmark, tickets in Waymark.</w:t>
+        <w:t>Suite SSO and a shared client graph: a client created once exists everywhere — devices in Milepost, invoices in Coastmark, tickets in Safeharbor.</w:t>
       </w:r>
     </w:p>
     <w:p>
@@ -10282,7 +10249,7 @@
                 <w:color w:val="1A2B45"/>
                 <w:sz w:val="19"/>
               </w:rPr>
-              <w:t>Milepost + Coastmark + Waymark bundle: meaningful discount for the full route — priced so the suite is the obvious choice, never a penalty for buying one app.</w:t>
+              <w:t>Milepost + Coastmark + Safeharbor bundle: meaningful discount for the full route — priced so the suite is the obvious choice, never a penalty for buying one app.</w:t>
             </w:r>
           </w:p>
         </w:tc>
@@ -11549,7 +11516,7 @@
                 <w:color w:val="1A2B45"/>
                 <w:sz w:val="19"/>
               </w:rPr>
-              <w:t>Waymark must stand alone — integration flows degrade gracefully to email/CSV; no phase gates on another product’s code.</w:t>
+              <w:t>Safeharbor must stand alone — integration flows degrade gracefully to email/CSV; no phase gates on another product’s code.</w:t>
             </w:r>
           </w:p>
         </w:tc>
@@ -11971,7 +11938,7 @@
           <w:color w:val="51627C"/>
           <w:sz w:val="18"/>
         </w:rPr>
-        <w:t>— 8 West IT, LLC · Waymark planning draft v1.0 · July 2026 —</w:t>
+        <w:t>— 8 West IT, LLC · Safeharbor planning draft v1.1 · July 2026 —</w:t>
       </w:r>
     </w:p>
     <w:sectPr>

</xml_diff>

<commit_message>
docs: bring everything up to par with shipped reality (v1.0 feature-complete)
- README: status → Sprints 1-5 shipped, full feature list, dogfood gate
- AGENTS: current state + 'ops lessons written in blood' (pull-first /
  deploy-from-main, SSH via origin IP behind Cloudflare, manual migration
  runbook 001-006, shared attachments dir, utf8_clean law, Westy prompt
  parity, mail-loop guards)
- deploy/README: origin-IP SSH, per-release migration step, server-side
  state the deploy doesn't manage (config blocks, shared storage)
- app/README: full keyboard model (n, /, ?, 1-5, deep search) + composer,
  presence, merge, resurface, CSAT, utf8_clean, Westy conventions
- rollout plan: cover v1.2 + Phase 1 marked shipped per sprint; docx
  regenerated
- repo hygiene: stale squash-merged branch feat/sprint-8.1.1-svc-intake
  deleted (0 open PRs; #1-#3 all merged)

Co-Authored-By: Claude Fable 5 <noreply@anthropic.com>
</commit_message>
<xml_diff>
--- a/docs/8_West_Helpdesk_App_Idea_and_Phased_Rollout.docx
+++ b/docs/8_West_Helpdesk_App_Idea_and_Phased_Rollout.docx
@@ -398,7 +398,7 @@
                 <w:color w:val="1A2B45"/>
                 <w:sz w:val="19"/>
               </w:rPr>
-              <w:t>July 21, 2026</w:t>
+              <w:t>August 2, 2026 (v1.2 revision)</w:t>
             </w:r>
           </w:p>
         </w:tc>
@@ -437,7 +437,7 @@
                 <w:color w:val="1A2B45"/>
                 <w:sz w:val="19"/>
               </w:rPr>
-              <w:t>v1.1 — name selected; Phase 0 underway</w:t>
+              <w:t>v1.2 — Sprints 1–5 shipped; Phase 1 feature-complete. Remaining: the dogfood exit gate (4 weeks live desk, p95 &lt; 300ms).</w:t>
             </w:r>
           </w:p>
         </w:tc>
@@ -9621,7 +9621,7 @@
           <w:color w:val="1A2B45"/>
           <w:sz w:val="21"/>
         </w:rPr>
-        <w:t>In (Sprint 1): 8 West ID suite SSO — the shared suite cookie Milepost ships, kill-switch gated — and Westy, the suite assistant, as first-run onboarding guide + advise-only how-to helper (advises, never acts; AI keys server-only)</w:t>
+        <w:t>In (Sprint 1, SHIPPED 2026-08-01): 8 West ID suite SSO (shared suite cookie) and Westy, the suite assistant, as first-run onboarding guide + advise-only how-to helper (advises, never acts; AI keys server-only)</w:t>
       </w:r>
     </w:p>
     <w:p>
@@ -9637,7 +9637,23 @@
           <w:color w:val="1A2B45"/>
           <w:sz w:val="21"/>
         </w:rPr>
-        <w:t>Out: SLAs, portal, automation, AI drafting, reporting beyond a list view</w:t>
+        <w:t>In (Sprints 2–5, SHIPPED 2026-08-02): composer with internal notes + '/' saved replies (merge fields) + time-at-reply; attachments both directions; conversation threading + inbound dedupe + bounce-loop protection; waiting auto-resurface; collision detection with stale-send blocking; merge tickets + duplicate suggestions; deep search (bodies + resolved) in the palette; '?' shortcut card; Reports with live numbers + billable CSV; one-click CSAT</w:t>
+      </w:r>
+    </w:p>
+    <w:p>
+      <w:pPr>
+        <w:pStyle w:val="ListBullet"/>
+        <w:spacing w:after="60" w:line="276" w:lineRule="auto"/>
+      </w:pPr>
+      <w:r>
+        <w:rPr>
+          <w:rFonts w:ascii="Inter" w:hAnsi="Inter"/>
+          <w:b w:val="0"/>
+          <w:i w:val="0"/>
+          <w:color w:val="1A2B45"/>
+          <w:sz w:val="21"/>
+        </w:rPr>
+        <w:t>Out: portal, automation builder, AI drafting, Coastmark handoff (P2/P3)</w:t>
       </w:r>
     </w:p>
     <w:p>

</xml_diff>

<commit_message>
docs: reconcile Customer Service Tools dark releases
</commit_message>
<xml_diff>
--- a/docs/8_West_Helpdesk_App_Idea_and_Phased_Rollout.docx
+++ b/docs/8_West_Helpdesk_App_Idea_and_Phased_Rollout.docx
@@ -226,48 +226,6 @@
         </w:rPr>
       </w:r>
     </w:p>
-    <w:p>
-      <w:pPr>
-        <w:spacing w:after="240"/>
-      </w:pPr>
-      <w:r>
-        <w:rPr>
-          <w:rFonts w:ascii="Inter" w:hAnsi="Inter"/>
-          <w:b w:val="0"/>
-          <w:i w:val="0"/>
-          <w:color w:val="1A2B45"/>
-          <w:sz w:val="4"/>
-        </w:rPr>
-      </w:r>
-    </w:p>
-    <w:p>
-      <w:pPr>
-        <w:spacing w:after="240"/>
-      </w:pPr>
-      <w:r>
-        <w:rPr>
-          <w:rFonts w:ascii="Inter" w:hAnsi="Inter"/>
-          <w:b w:val="0"/>
-          <w:i w:val="0"/>
-          <w:color w:val="1A2B45"/>
-          <w:sz w:val="4"/>
-        </w:rPr>
-      </w:r>
-    </w:p>
-    <w:p>
-      <w:pPr>
-        <w:spacing w:after="240"/>
-      </w:pPr>
-      <w:r>
-        <w:rPr>
-          <w:rFonts w:ascii="Inter" w:hAnsi="Inter"/>
-          <w:b w:val="0"/>
-          <w:i w:val="0"/>
-          <w:color w:val="1A2B45"/>
-          <w:sz w:val="4"/>
-        </w:rPr>
-      </w:r>
-    </w:p>
     <w:tbl>
       <w:tblPr>
         <w:tblW w:type="auto" w:w="0"/>
@@ -398,7 +356,7 @@
                 <w:color w:val="1A2B45"/>
                 <w:sz w:val="19"/>
               </w:rPr>
-              <w:t>August 2, 2026 (v1.2 revision)</w:t>
+              <w:t>August 26, 2026 (v1.3 roadmap alignment)</w:t>
             </w:r>
           </w:p>
         </w:tc>
@@ -437,7 +395,7 @@
                 <w:color w:val="1A2B45"/>
                 <w:sz w:val="19"/>
               </w:rPr>
-              <w:t>v1.2 — Sprints 1–5 shipped; Phase 1 feature-complete. Remaining: the dogfood exit gate (4 weeks live desk, p95 &lt; 300ms).</w:t>
+              <w:t>v1.3 — the core desk, versioned service goals, and approval-grade technician time are live. Draft-line export, the customer portal, and archived reports are deployed dark pending controlled canaries; the dogfood exit gate also remains.</w:t>
             </w:r>
           </w:p>
         </w:tc>
@@ -539,7 +497,7 @@
           <w:color w:val="1A2B45"/>
           <w:sz w:val="21"/>
         </w:rPr>
-        <w:t>A help desk purpose-built for small MSPs (1–25 technicians) that is radically simpler, cleaner, and faster than ConnectWise, Autotask, or HaloPSA — because it is designed around the ticket queue technicians actually live in all day, and because it is natively connected to Milepost (so alerts arrive as tickets with the device, client, and contract already attached) and to Coastmark (so approved time becomes an invoice line without a sync job, an export, or a prayer). No competitor owns the RMM, the ledger, and the help desk. We would.</w:t>
+        <w:t>A help desk purpose-built for small MSPs (1–25 technicians) that is radically simpler, cleaner, and faster than ConnectWise, Autotask, or HaloPSA — because it is designed around the ticket queue technicians actually live in all day, and because it uses narrow, owned suite seams: Milepost supplies tenant, asset, and telemetry context to Safeharbor-owned tickets, while Coastmark may accept only owner/admin-approved Safeharbor time into draft invoice lines. Coastmark alone owns rates, tax, invoices, posting, sending, payments, and ledger behavior.</w:t>
       </w:r>
     </w:p>
     <w:p>
@@ -2281,11 +2239,6 @@
         </w:tc>
       </w:tr>
     </w:tbl>
-    <w:p>
-      <w:r>
-        <w:br w:type="page"/>
-      </w:r>
-    </w:p>
     <w:p>
       <w:pPr>
         <w:spacing w:before="40" w:after="0"/>
@@ -5694,7 +5647,7 @@
           <w:color w:val="1A2B45"/>
           <w:sz w:val="21"/>
         </w:rPr>
-        <w:t>White-labeled client portal (tickets, status, invoices, KB) — HaloPSA’s default portal is famously “ships ugly”</w:t>
+        <w:t>White-labeled client portal (tickets, status, invoices, KB) — a market expectation; the current Safeharbor portal is intentionally ticket-summary-only</w:t>
       </w:r>
     </w:p>
     <w:p>
@@ -5821,7 +5774,7 @@
           <w:color w:val="1A2B45"/>
           <w:sz w:val="21"/>
         </w:rPr>
-        <w:t>CSAT surveys, dispatch/calendar and on-call, approval workflows, chat-first intake, remote session launch from ticket</w:t>
+        <w:t>CSAT surveys, dispatch/calendar and on-call, approval workflows, chat-first intake, remote-session launch for technicians (customer endpoint control is outside the current Safeharbor scope)</w:t>
       </w:r>
     </w:p>
     <w:p>
@@ -7099,7 +7052,7 @@
           <w:color w:val="12345F"/>
           <w:sz w:val="21"/>
         </w:rPr>
-        <w:t xml:space="preserve">Architecture, not integrations. </w:t>
+        <w:t xml:space="preserve">Clear ownership, narrow seams. </w:t>
       </w:r>
       <w:r>
         <w:rPr>
@@ -7109,7 +7062,7 @@
           <w:color w:val="1A2B45"/>
           <w:sz w:val="21"/>
         </w:rPr>
-        <w:t>Owning Milepost (RMM) and Coastmark (ledger) deletes the two most-hated categories: sync jobs and billing reconciliation. Alert→ticket→time→invoice with zero connectors.</w:t>
+        <w:t>Safeharbor owns tickets, service workflows, SLA clocks, time, portal views, and reports. Milepost supplies context only; Coastmark owns every financial decision and may receive approved time as draft lines only, never as an automatic posting command.</w:t>
       </w:r>
     </w:p>
     <w:p>
@@ -7162,11 +7115,6 @@
           <w:sz w:val="21"/>
         </w:rPr>
         <w:t>Free guided importers from ConnectWise, Autotask, Syncro, and HaloPSA — the incumbents’ only real moat.</w:t>
-      </w:r>
-    </w:p>
-    <w:p>
-      <w:r>
-        <w:br w:type="page"/>
       </w:r>
     </w:p>
     <w:p>
@@ -7229,7 +7177,7 @@
           <w:color w:val="1A2B45"/>
           <w:sz w:val="21"/>
         </w:rPr>
-        <w:t>For MSPs of 1–25 technicians who live in the ticket queue all day, Safeharbor is the help desk in the 8 West IT suite that turns every client signal — email, portal, chat, or Milepost alert — into a resolved, invoiced outcome with the fewest clicks in the industry. Unlike ConnectWise and Autotask, it is fast, quiet, and learnable in an afternoon. Unlike Syncro and Atera, it does not sacrifice SLA, contract, or reporting depth. Unlike HaloPSA, it needs no dedicated admin and no minimum seat count.</w:t>
+        <w:t>For MSPs of 1–25 technicians who live in the ticket queue all day, Safeharbor is the help desk in the 8 West IT suite that turns every client signal — email, portal, chat, or Milepost alert — into a resolved, auditable service outcome with the fewest clicks in the industry. Approved time may later cross one controlled seam into Coastmark draft lines; Safeharbor never posts an invoice. Unlike ConnectWise and Autotask, it is fast, quiet, and learnable in an afternoon. Unlike Syncro and Atera, it does not sacrifice SLA, contract, or reporting depth. Unlike HaloPSA, it needs no dedicated admin and no minimum seat count.</w:t>
       </w:r>
     </w:p>
     <w:p>
@@ -7589,7 +7537,7 @@
                 <w:color w:val="1A2B45"/>
                 <w:sz w:val="18"/>
               </w:rPr>
-              <w:t>Email-to-ticket (custom domain), client portal, widget; Teams intake in P3</w:t>
+              <w:t>Email/service intake live; customer portal is read-only summaries; widget and Teams intake deferred</w:t>
             </w:r>
           </w:p>
         </w:tc>
@@ -7834,7 +7782,7 @@
                 <w:color w:val="1A2B45"/>
                 <w:sz w:val="18"/>
               </w:rPr>
-              <w:t>One-click timers, auto work-log, billable flags, rates; Coastmark invoice handoff</w:t>
+              <w:t>Approval-grade timers/work logs live; operator-controlled Coastmark draft-line handoff deployed dark</w:t>
             </w:r>
           </w:p>
         </w:tc>
@@ -7915,7 +7863,7 @@
                 <w:color w:val="1A2B45"/>
                 <w:sz w:val="18"/>
               </w:rPr>
-              <w:t>Policies, business hours, breach warnings (gold) and healthy states (mint)</w:t>
+              <w:t>Versioned elapsed first-response targets live; business hours, holidays, and pause execution deferred</w:t>
             </w:r>
           </w:p>
         </w:tc>
@@ -7997,7 +7945,7 @@
                 <w:color w:val="1A2B45"/>
                 <w:sz w:val="18"/>
               </w:rPr>
-              <w:t>White-label submit/status/KB; invoices visible via Coastmark</w:t>
+              <w:t>Current slice: read-only ticket summaries through 8 West ID; no billing, ticket detail, mutation, or endpoint control</w:t>
             </w:r>
           </w:p>
         </w:tc>
@@ -8160,7 +8108,7 @@
                 <w:color w:val="1A2B45"/>
                 <w:sz w:val="18"/>
               </w:rPr>
-              <w:t>Alert→ticket with asset context; device panel on ticket; remote session launch</w:t>
+              <w:t>Signed alert intake plus tenant/asset/telemetry context only; no customer endpoint control</w:t>
             </w:r>
           </w:p>
         </w:tc>
@@ -8323,7 +8271,7 @@
                 <w:color w:val="1A2B45"/>
                 <w:sz w:val="18"/>
               </w:rPr>
-              <w:t>8 West ID sign-in via the shared suite cookie (Milepost parity); full OIDC flow later</w:t>
+              <w:t>Staff sign-in via the shared suite cookie; separate default-off oidc_v1 customer portal with explicit binding</w:t>
             </w:r>
           </w:p>
         </w:tc>
@@ -8350,7 +8298,7 @@
                 <w:color w:val="1A2B45"/>
                 <w:sz w:val="18"/>
               </w:rPr>
-              <w:t>P1</w:t>
+              <w:t>P1–P2</w:t>
             </w:r>
           </w:p>
         </w:tc>
@@ -8567,7 +8515,7 @@
                 <w:color w:val="1A2B45"/>
                 <w:sz w:val="18"/>
               </w:rPr>
-              <w:t>SLA attainment, first-response, aging, utilization, client health dashboards</w:t>
+              <w:t>SLA/response/aging facts live; versioned archived weekly summaries with delivery evidence deployed dark</w:t>
             </w:r>
           </w:p>
         </w:tc>
@@ -9034,7 +8982,7 @@
           <w:color w:val="12345F"/>
           <w:sz w:val="26"/>
         </w:rPr>
-        <w:t>5.4  Suite integration — the killer flows</w:t>
+        <w:t>5.4  Suite integration — narrow owned flows</w:t>
       </w:r>
     </w:p>
     <w:p>
@@ -9060,7 +9008,7 @@
           <w:color w:val="1A2B45"/>
           <w:sz w:val="21"/>
         </w:rPr>
-        <w:t>A server alert becomes a ticket with the device, client, site, open alerts, and recent patches already attached. One click opens a remote session from the ticket. Closing the ticket can auto-resolve the alert.</w:t>
+        <w:t>A signed server alert can create a Safeharbor-owned ticket carrying bounded tenant, asset, and telemetry context. Milepost does not own the ticket, SLA clock, time, portal view, or report, and this seam exposes no customer endpoint control.</w:t>
       </w:r>
     </w:p>
     <w:p>
@@ -9086,7 +9034,7 @@
           <w:color w:val="1A2B45"/>
           <w:sz w:val="21"/>
         </w:rPr>
-        <w:t>Approved time on a ticket flows to the client’s agreement; month-end invoicing is a review screen, not a reconciliation project. No exports, no sync jobs, no “why is QuickBooks different again.”</w:t>
+        <w:t>After a Safeharbor owner/admin approves billable time, an operator may send one exact fact to a separately mapped Coastmark draft line. Coastmark owns agreement, rate, tax, cents, invoice, posting, sending, Checkout, payments, and ledger behavior; the seam can never perform those actions.</w:t>
       </w:r>
     </w:p>
     <w:p>
@@ -9102,7 +9050,7 @@
           <w:color w:val="12345F"/>
           <w:sz w:val="21"/>
         </w:rPr>
-        <w:t xml:space="preserve">One sign-in, one client record. </w:t>
+        <w:t xml:space="preserve">8 West ID → Safeharbor portal. </w:t>
       </w:r>
       <w:r>
         <w:rPr>
@@ -9112,7 +9060,7 @@
           <w:color w:val="1A2B45"/>
           <w:sz w:val="21"/>
         </w:rPr>
-        <w:t>Suite SSO and a shared client graph: a client created once exists everywhere — devices in Milepost, invoices in Coastmark, tickets in Safeharbor.</w:t>
+        <w:t>8 West ID owns OIDC identity, tenant/product/role claims, and preferences. Safeharbor owns an explicit identity-tenant-to-client binding and read-only ticket-summary queries; there is no inferred shared client graph.</w:t>
       </w:r>
     </w:p>
     <w:p>
@@ -9258,7 +9206,7 @@
           <w:color w:val="1A2B45"/>
           <w:sz w:val="21"/>
         </w:rPr>
-        <w:t>One page per client: open tickets, devices, agreement, recent invoices (via Coastmark), contacts, and health notes — the “answer the phone smart” screen.</w:t>
+        <w:t>One Safeharbor-owned page per client: tickets, contacts, service history, and clearly attributed context. The current scope does not copy Coastmark financial records or expose Milepost endpoint control.</w:t>
       </w:r>
     </w:p>
     <w:p>
@@ -9707,7 +9655,7 @@
           <w:color w:val="12345F"/>
           <w:sz w:val="26"/>
         </w:rPr>
-        <w:t>Phase 2 — MSP Essentials + Suite Integration  ·  Months 5–8</w:t>
+        <w:t>Phase 2 — MSP Essentials + Controlled Suite Seams  ·  Months 5–8</w:t>
       </w:r>
     </w:p>
     <w:p>
@@ -9722,7 +9670,7 @@
           <w:color w:val="12345F"/>
           <w:sz w:val="21"/>
         </w:rPr>
-        <w:t>Goal: Become a real MSP tool and wire in Milepost &amp; Coastmark. Private beta with 10–20 design-partner MSPs.</w:t>
+        <w:t>Goal: Deepen the desk while preserving independent ownership and controlled activation.</w:t>
       </w:r>
     </w:p>
     <w:p>
@@ -9738,7 +9686,7 @@
           <w:color w:val="1A2B45"/>
           <w:sz w:val="21"/>
         </w:rPr>
-        <w:t>In: SLA policies + business hours, one-click timers &amp; auto work-log, white-label client portal, KB basics, Milepost alert→ticket + device panel + remote launch, Coastmark approved-time→invoice handoff</w:t>
+        <w:t>In (LIVE): corrected response-SLA semantics, versioned service-goal policies, and approval-grade technician time</w:t>
       </w:r>
     </w:p>
     <w:p>
@@ -9754,7 +9702,39 @@
           <w:color w:val="1A2B45"/>
           <w:sz w:val="21"/>
         </w:rPr>
-        <w:t>Out: automation builder, AI assist, mobile, dispatch</w:t>
+        <w:t>In (DEPLOYED DARK): approved Safeharbor time → Coastmark draft lines only; 8 West ID customer ticket-summary portal; versioned archived delivery-tracked weekly reports</w:t>
+      </w:r>
+    </w:p>
+    <w:p>
+      <w:pPr>
+        <w:pStyle w:val="ListBullet"/>
+        <w:spacing w:after="60" w:line="276" w:lineRule="auto"/>
+      </w:pPr>
+      <w:r>
+        <w:rPr>
+          <w:rFonts w:ascii="Inter" w:hAnsi="Inter"/>
+          <w:b w:val="0"/>
+          <w:i w:val="0"/>
+          <w:color w:val="1A2B45"/>
+          <w:sz w:val="21"/>
+        </w:rPr>
+        <w:t>Milepost boundary: tenant/asset/telemetry context only; Safeharbor owns every ticket, workflow, SLA clock, time record, portal view, and report</w:t>
+      </w:r>
+    </w:p>
+    <w:p>
+      <w:pPr>
+        <w:pStyle w:val="ListBullet"/>
+        <w:spacing w:after="60" w:line="276" w:lineRule="auto"/>
+      </w:pPr>
+      <w:r>
+        <w:rPr>
+          <w:rFonts w:ascii="Inter" w:hAnsi="Inter"/>
+          <w:b w:val="0"/>
+          <w:i w:val="0"/>
+          <w:color w:val="1A2B45"/>
+          <w:sz w:val="21"/>
+        </w:rPr>
+        <w:t>Out: automatic invoice posting/sending/payment/ledger actions, inferred customer mappings, customer endpoint control, broader portal billing/detail/mutation, automation builder, autonomous AI actions, mobile, and dispatch</w:t>
       </w:r>
     </w:p>
     <w:p>
@@ -9779,7 +9759,7 @@
           <w:color w:val="1A2B45"/>
           <w:sz w:val="21"/>
         </w:rPr>
-        <w:t>Beta NPS ≥ 40; ≥ 80% of billable time entered same-day (vs. the industry’s Friday batch); every beta MSP running at least one Milepost and one Coastmark flow.</w:t>
+        <w:t>Exit only after exact real canaries: Coastmark-owned mapping/rate/tax facts; one registered Safeharbor application OIDC client; one explicitly approved identity-tenant → Safeharbor tenant/client binding plus a real client-role user with signed-in isolation/revocation proof; and one archived report with separate recipient confirmation. Never invent a customer, credential, financial fact, or recipient to satisfy a gate.</w:t>
       </w:r>
     </w:p>
     <w:p>
@@ -11601,7 +11581,7 @@
                 <w:color w:val="1A2B45"/>
                 <w:sz w:val="19"/>
               </w:rPr>
-              <w:t>Phase 2 is explicitly the depth phase — SLAs, time-to-invoice, portal ship before launch. Never launch against Halo without them.</w:t>
+              <w:t>Phase 2 adds versioned service goals, approval-grade time, and controlled draft-only/report/portal seams without collapsing product ownership or turning a dark deployment into an activation claim.</w:t>
             </w:r>
           </w:p>
         </w:tc>
@@ -12133,11 +12113,11 @@
           <w:color w:val="51627C"/>
           <w:sz w:val="18"/>
         </w:rPr>
-        <w:t>— 8 West IT, LLC · Safeharbor planning draft v1.1 · July 2026 —</w:t>
+        <w:t>— 8 West IT, LLC · Safeharbor planning draft v1.3 · August 2026 —</w:t>
       </w:r>
     </w:p>
     <w:sectPr>
-      <w:footerReference w:type="default" r:id="rId12"/>
+      <w:footerReference w:type="default" r:id="rId9"/>
       <w:pgSz w:w="12240" w:h="15840"/>
       <w:pgMar w:top="1152" w:right="1296" w:bottom="1152" w:left="1296" w:header="720" w:footer="720" w:gutter="0"/>
       <w:cols w:space="720"/>
@@ -36348,269 +36328,10 @@
 <b:Sources xmlns:b="http://schemas.openxmlformats.org/officeDocument/2006/bibliography" xmlns="http://schemas.openxmlformats.org/officeDocument/2006/bibliography" SelectedStyle="/APA.XSL" StyleName="APA"/>
 </file>
 
-<file path=customXml/item2.xml><?xml version="1.0" encoding="utf-8"?>
-<ct:contentTypeSchema xmlns:ct="http://schemas.microsoft.com/office/2006/metadata/contentType" xmlns:ma="http://schemas.microsoft.com/office/2006/metadata/properties/metaAttributes" ct:_="" ma:_="" ma:contentTypeName="Document" ma:contentTypeID="0x01010039E3B0051F1B8149821CDE4A44F7325D" ma:contentTypeVersion="16" ma:contentTypeDescription="Create a new document." ma:contentTypeScope="" ma:versionID="434cc72582867d24817bd9642aa5dec8">
-  <xsd:schema xmlns:xsd="http://www.w3.org/2001/XMLSchema" xmlns:xs="http://www.w3.org/2001/XMLSchema" xmlns:p="http://schemas.microsoft.com/office/2006/metadata/properties" xmlns:ns2="f13b65d8-2514-44d6-8b44-36db071ed2c9" xmlns:ns3="b3e25f06-2eee-4e34-ad22-7c7a34ef7bf5" targetNamespace="http://schemas.microsoft.com/office/2006/metadata/properties" ma:root="true" ma:fieldsID="e2ac5dc681e27ab38ec87aa21633a069" ns2:_="" ns3:_="">
-    <xsd:import namespace="f13b65d8-2514-44d6-8b44-36db071ed2c9"/>
-    <xsd:import namespace="b3e25f06-2eee-4e34-ad22-7c7a34ef7bf5"/>
-    <xsd:element name="properties">
-      <xsd:complexType>
-        <xsd:sequence>
-          <xsd:element name="documentManagement">
-            <xsd:complexType>
-              <xsd:all>
-                <xsd:element ref="ns2:MediaServiceMetadata" minOccurs="0"/>
-                <xsd:element ref="ns2:MediaServiceFastMetadata" minOccurs="0"/>
-                <xsd:element ref="ns2:MediaServiceDateTaken" minOccurs="0"/>
-                <xsd:element ref="ns2:MediaServiceAutoTags" minOccurs="0"/>
-                <xsd:element ref="ns2:MediaServiceOCR" minOccurs="0"/>
-                <xsd:element ref="ns2:MediaServiceGenerationTime" minOccurs="0"/>
-                <xsd:element ref="ns2:MediaServiceEventHashCode" minOccurs="0"/>
-                <xsd:element ref="ns2:MediaServiceAutoKeyPoints" minOccurs="0"/>
-                <xsd:element ref="ns2:MediaServiceKeyPoints" minOccurs="0"/>
-                <xsd:element ref="ns2:MediaServiceObjectDetectorVersions" minOccurs="0"/>
-                <xsd:element ref="ns2:MediaLengthInSeconds" minOccurs="0"/>
-                <xsd:element ref="ns2:MediaServiceLocation" minOccurs="0"/>
-                <xsd:element ref="ns2:lcf76f155ced4ddcb4097134ff3c332f" minOccurs="0"/>
-                <xsd:element ref="ns3:TaxCatchAll" minOccurs="0"/>
-                <xsd:element ref="ns2:MediaServiceSearchProperties" minOccurs="0"/>
-              </xsd:all>
-            </xsd:complexType>
-          </xsd:element>
-        </xsd:sequence>
-      </xsd:complexType>
-    </xsd:element>
-  </xsd:schema>
-  <xsd:schema xmlns:xsd="http://www.w3.org/2001/XMLSchema" xmlns:xs="http://www.w3.org/2001/XMLSchema" xmlns:dms="http://schemas.microsoft.com/office/2006/documentManagement/types" xmlns:pc="http://schemas.microsoft.com/office/infopath/2007/PartnerControls" targetNamespace="f13b65d8-2514-44d6-8b44-36db071ed2c9" elementFormDefault="qualified">
-    <xsd:import namespace="http://schemas.microsoft.com/office/2006/documentManagement/types"/>
-    <xsd:import namespace="http://schemas.microsoft.com/office/infopath/2007/PartnerControls"/>
-    <xsd:element name="MediaServiceMetadata" ma:index="8" nillable="true" ma:displayName="MediaServiceMetadata" ma:hidden="true" ma:internalName="MediaServiceMetadata" ma:readOnly="true">
-      <xsd:simpleType>
-        <xsd:restriction base="dms:Note"/>
-      </xsd:simpleType>
-    </xsd:element>
-    <xsd:element name="MediaServiceFastMetadata" ma:index="9" nillable="true" ma:displayName="MediaServiceFastMetadata" ma:hidden="true" ma:internalName="MediaServiceFastMetadata" ma:readOnly="true">
-      <xsd:simpleType>
-        <xsd:restriction base="dms:Note"/>
-      </xsd:simpleType>
-    </xsd:element>
-    <xsd:element name="MediaServiceDateTaken" ma:index="10" nillable="true" ma:displayName="MediaServiceDateTaken" ma:hidden="true" ma:internalName="MediaServiceDateTaken" ma:readOnly="true">
-      <xsd:simpleType>
-        <xsd:restriction base="dms:Text"/>
-      </xsd:simpleType>
-    </xsd:element>
-    <xsd:element name="MediaServiceAutoTags" ma:index="11" nillable="true" ma:displayName="Tags" ma:internalName="MediaServiceAutoTags" ma:readOnly="true">
-      <xsd:simpleType>
-        <xsd:restriction base="dms:Text"/>
-      </xsd:simpleType>
-    </xsd:element>
-    <xsd:element name="MediaServiceOCR" ma:index="12" nillable="true" ma:displayName="Extracted Text" ma:internalName="MediaServiceOCR" ma:readOnly="true">
-      <xsd:simpleType>
-        <xsd:restriction base="dms:Note">
-          <xsd:maxLength value="255"/>
-        </xsd:restriction>
-      </xsd:simpleType>
-    </xsd:element>
-    <xsd:element name="MediaServiceGenerationTime" ma:index="13" nillable="true" ma:displayName="MediaServiceGenerationTime" ma:hidden="true" ma:internalName="MediaServiceGenerationTime" ma:readOnly="true">
-      <xsd:simpleType>
-        <xsd:restriction base="dms:Text"/>
-      </xsd:simpleType>
-    </xsd:element>
-    <xsd:element name="MediaServiceEventHashCode" ma:index="14" nillable="true" ma:displayName="MediaServiceEventHashCode" ma:hidden="true" ma:internalName="MediaServiceEventHashCode" ma:readOnly="true">
-      <xsd:simpleType>
-        <xsd:restriction base="dms:Text"/>
-      </xsd:simpleType>
-    </xsd:element>
-    <xsd:element name="MediaServiceAutoKeyPoints" ma:index="15" nillable="true" ma:displayName="MediaServiceAutoKeyPoints" ma:hidden="true" ma:internalName="MediaServiceAutoKeyPoints" ma:readOnly="true">
-      <xsd:simpleType>
-        <xsd:restriction base="dms:Note"/>
-      </xsd:simpleType>
-    </xsd:element>
-    <xsd:element name="MediaServiceKeyPoints" ma:index="16" nillable="true" ma:displayName="KeyPoints" ma:internalName="MediaServiceKeyPoints" ma:readOnly="true">
-      <xsd:simpleType>
-        <xsd:restriction base="dms:Note">
-          <xsd:maxLength value="255"/>
-        </xsd:restriction>
-      </xsd:simpleType>
-    </xsd:element>
-    <xsd:element name="MediaServiceObjectDetectorVersions" ma:index="17" nillable="true" ma:displayName="MediaServiceObjectDetectorVersions" ma:hidden="true" ma:indexed="true" ma:internalName="MediaServiceObjectDetectorVersions" ma:readOnly="true">
-      <xsd:simpleType>
-        <xsd:restriction base="dms:Text"/>
-      </xsd:simpleType>
-    </xsd:element>
-    <xsd:element name="MediaLengthInSeconds" ma:index="18" nillable="true" ma:displayName="MediaLengthInSeconds" ma:hidden="true" ma:internalName="MediaLengthInSeconds" ma:readOnly="true">
-      <xsd:simpleType>
-        <xsd:restriction base="dms:Unknown"/>
-      </xsd:simpleType>
-    </xsd:element>
-    <xsd:element name="MediaServiceLocation" ma:index="19" nillable="true" ma:displayName="Location" ma:indexed="true" ma:internalName="MediaServiceLocation" ma:readOnly="true">
-      <xsd:simpleType>
-        <xsd:restriction base="dms:Text"/>
-      </xsd:simpleType>
-    </xsd:element>
-    <xsd:element name="lcf76f155ced4ddcb4097134ff3c332f" ma:index="21" nillable="true" ma:taxonomy="true" ma:internalName="lcf76f155ced4ddcb4097134ff3c332f" ma:taxonomyFieldName="MediaServiceImageTags" ma:displayName="Image Tags" ma:readOnly="false" ma:fieldId="{5cf76f15-5ced-4ddc-b409-7134ff3c332f}" ma:taxonomyMulti="true" ma:sspId="6b93af32-b32d-4943-85de-e5669dcebf95" ma:termSetId="09814cd3-568e-fe90-9814-8d621ff8fb84" ma:anchorId="fba54fb3-c3e1-fe81-a776-ca4b69148c4d" ma:open="true" ma:isKeyword="false">
-      <xsd:complexType>
-        <xsd:sequence>
-          <xsd:element ref="pc:Terms" minOccurs="0" maxOccurs="1"/>
-        </xsd:sequence>
-      </xsd:complexType>
-    </xsd:element>
-    <xsd:element name="MediaServiceSearchProperties" ma:index="23" nillable="true" ma:displayName="MediaServiceSearchProperties" ma:hidden="true" ma:internalName="MediaServiceSearchProperties" ma:readOnly="true">
-      <xsd:simpleType>
-        <xsd:restriction base="dms:Note"/>
-      </xsd:simpleType>
-    </xsd:element>
-  </xsd:schema>
-  <xsd:schema xmlns:xsd="http://www.w3.org/2001/XMLSchema" xmlns:xs="http://www.w3.org/2001/XMLSchema" xmlns:dms="http://schemas.microsoft.com/office/2006/documentManagement/types" xmlns:pc="http://schemas.microsoft.com/office/infopath/2007/PartnerControls" targetNamespace="b3e25f06-2eee-4e34-ad22-7c7a34ef7bf5" elementFormDefault="qualified">
-    <xsd:import namespace="http://schemas.microsoft.com/office/2006/documentManagement/types"/>
-    <xsd:import namespace="http://schemas.microsoft.com/office/infopath/2007/PartnerControls"/>
-    <xsd:element name="TaxCatchAll" ma:index="22" nillable="true" ma:displayName="Taxonomy Catch All Column" ma:hidden="true" ma:list="{9aafd8df-9d1d-465f-90d5-5f8865ed4183}" ma:internalName="TaxCatchAll" ma:showField="CatchAllData" ma:web="b3e25f06-2eee-4e34-ad22-7c7a34ef7bf5">
-      <xsd:complexType>
-        <xsd:complexContent>
-          <xsd:extension base="dms:MultiChoiceLookup">
-            <xsd:sequence>
-              <xsd:element name="Value" type="dms:Lookup" maxOccurs="unbounded" minOccurs="0" nillable="true"/>
-            </xsd:sequence>
-          </xsd:extension>
-        </xsd:complexContent>
-      </xsd:complexType>
-    </xsd:element>
-  </xsd:schema>
-  <xsd:schema xmlns="http://schemas.openxmlformats.org/package/2006/metadata/core-properties" xmlns:xsd="http://www.w3.org/2001/XMLSchema" xmlns:xsi="http://www.w3.org/2001/XMLSchema-instance" xmlns:dc="http://purl.org/dc/elements/1.1/" xmlns:dcterms="http://purl.org/dc/terms/" xmlns:odoc="http://schemas.microsoft.com/internal/obd" targetNamespace="http://schemas.openxmlformats.org/package/2006/metadata/core-properties" elementFormDefault="qualified" attributeFormDefault="unqualified" blockDefault="#all">
-    <xsd:import namespace="http://purl.org/dc/elements/1.1/" schemaLocation="http://dublincore.org/schemas/xmls/qdc/2003/04/02/dc.xsd"/>
-    <xsd:import namespace="http://purl.org/dc/terms/" schemaLocation="http://dublincore.org/schemas/xmls/qdc/2003/04/02/dcterms.xsd"/>
-    <xsd:element name="coreProperties" type="CT_coreProperties"/>
-    <xsd:complexType name="CT_coreProperties">
-      <xsd:all>
-        <xsd:element ref="dc:creator" minOccurs="0" maxOccurs="1"/>
-        <xsd:element ref="dcterms:created" minOccurs="0" maxOccurs="1"/>
-        <xsd:element ref="dc:identifier" minOccurs="0" maxOccurs="1"/>
-        <xsd:element name="contentType" minOccurs="0" maxOccurs="1" type="xsd:string" ma:index="0" ma:displayName="Content Type"/>
-        <xsd:element ref="dc:title" minOccurs="0" maxOccurs="1" ma:index="4" ma:displayName="Title"/>
-        <xsd:element ref="dc:subject" minOccurs="0" maxOccurs="1"/>
-        <xsd:element ref="dc:description" minOccurs="0" maxOccurs="1"/>
-        <xsd:element name="keywords" minOccurs="0" maxOccurs="1" type="xsd:string"/>
-        <xsd:element ref="dc:language" minOccurs="0" maxOccurs="1"/>
-        <xsd:element name="category" minOccurs="0" maxOccurs="1" type="xsd:string"/>
-        <xsd:element name="version" minOccurs="0" maxOccurs="1" type="xsd:string"/>
-        <xsd:element name="revision" minOccurs="0" maxOccurs="1" type="xsd:string">
-          <xsd:annotation>
-            <xsd:documentation>
-                        This value indicates the number of saves or revisions. The application is responsible for updating this value after each revision.
-                    </xsd:documentation>
-          </xsd:annotation>
-        </xsd:element>
-        <xsd:element name="lastModifiedBy" minOccurs="0" maxOccurs="1" type="xsd:string"/>
-        <xsd:element ref="dcterms:modified" minOccurs="0" maxOccurs="1"/>
-        <xsd:element name="contentStatus" minOccurs="0" maxOccurs="1" type="xsd:string"/>
-      </xsd:all>
-    </xsd:complexType>
-  </xsd:schema>
-  <xs:schema xmlns:pc="http://schemas.microsoft.com/office/infopath/2007/PartnerControls" xmlns:xs="http://www.w3.org/2001/XMLSchema" targetNamespace="http://schemas.microsoft.com/office/infopath/2007/PartnerControls" elementFormDefault="qualified" attributeFormDefault="unqualified">
-    <xs:element name="Person">
-      <xs:complexType>
-        <xs:sequence>
-          <xs:element ref="pc:DisplayName" minOccurs="0"/>
-          <xs:element ref="pc:AccountId" minOccurs="0"/>
-          <xs:element ref="pc:AccountType" minOccurs="0"/>
-        </xs:sequence>
-      </xs:complexType>
-    </xs:element>
-    <xs:element name="DisplayName" type="xs:string"/>
-    <xs:element name="AccountId" type="xs:string"/>
-    <xs:element name="AccountType" type="xs:string"/>
-    <xs:element name="BDCAssociatedEntity">
-      <xs:complexType>
-        <xs:sequence>
-          <xs:element ref="pc:BDCEntity" minOccurs="0" maxOccurs="unbounded"/>
-        </xs:sequence>
-        <xs:attribute ref="pc:EntityNamespace"/>
-        <xs:attribute ref="pc:EntityName"/>
-        <xs:attribute ref="pc:SystemInstanceName"/>
-        <xs:attribute ref="pc:AssociationName"/>
-      </xs:complexType>
-    </xs:element>
-    <xs:attribute name="EntityNamespace" type="xs:string"/>
-    <xs:attribute name="EntityName" type="xs:string"/>
-    <xs:attribute name="SystemInstanceName" type="xs:string"/>
-    <xs:attribute name="AssociationName" type="xs:string"/>
-    <xs:element name="BDCEntity">
-      <xs:complexType>
-        <xs:sequence>
-          <xs:element ref="pc:EntityDisplayName" minOccurs="0"/>
-          <xs:element ref="pc:EntityInstanceReference" minOccurs="0"/>
-          <xs:element ref="pc:EntityId1" minOccurs="0"/>
-          <xs:element ref="pc:EntityId2" minOccurs="0"/>
-          <xs:element ref="pc:EntityId3" minOccurs="0"/>
-          <xs:element ref="pc:EntityId4" minOccurs="0"/>
-          <xs:element ref="pc:EntityId5" minOccurs="0"/>
-        </xs:sequence>
-      </xs:complexType>
-    </xs:element>
-    <xs:element name="EntityDisplayName" type="xs:string"/>
-    <xs:element name="EntityInstanceReference" type="xs:string"/>
-    <xs:element name="EntityId1" type="xs:string"/>
-    <xs:element name="EntityId2" type="xs:string"/>
-    <xs:element name="EntityId3" type="xs:string"/>
-    <xs:element name="EntityId4" type="xs:string"/>
-    <xs:element name="EntityId5" type="xs:string"/>
-    <xs:element name="Terms">
-      <xs:complexType>
-        <xs:sequence>
-          <xs:element ref="pc:TermInfo" minOccurs="0" maxOccurs="unbounded"/>
-        </xs:sequence>
-      </xs:complexType>
-    </xs:element>
-    <xs:element name="TermInfo">
-      <xs:complexType>
-        <xs:sequence>
-          <xs:element ref="pc:TermName" minOccurs="0"/>
-          <xs:element ref="pc:TermId" minOccurs="0"/>
-        </xs:sequence>
-      </xs:complexType>
-    </xs:element>
-    <xs:element name="TermName" type="xs:string"/>
-    <xs:element name="TermId" type="xs:string"/>
-  </xs:schema>
-</ct:contentTypeSchema>
-</file>
-
-<file path=customXml/item3.xml><?xml version="1.0" encoding="utf-8"?>
-<?mso-contentType ?>
-<FormTemplates xmlns="http://schemas.microsoft.com/sharepoint/v3/contenttype/forms">
-  <Display>DocumentLibraryForm</Display>
-  <Edit>DocumentLibraryForm</Edit>
-  <New>DocumentLibraryForm</New>
-</FormTemplates>
-</file>
-
-<file path=customXml/item4.xml><?xml version="1.0" encoding="utf-8"?>
-<p:properties xmlns:p="http://schemas.microsoft.com/office/2006/metadata/properties" xmlns:xsi="http://www.w3.org/2001/XMLSchema-instance" xmlns:pc="http://schemas.microsoft.com/office/infopath/2007/PartnerControls">
-  <documentManagement>
-    <TaxCatchAll xmlns="b3e25f06-2eee-4e34-ad22-7c7a34ef7bf5" xsi:nil="true"/>
-    <lcf76f155ced4ddcb4097134ff3c332f xmlns="f13b65d8-2514-44d6-8b44-36db071ed2c9">
-      <Terms xmlns="http://schemas.microsoft.com/office/infopath/2007/PartnerControls"/>
-    </lcf76f155ced4ddcb4097134ff3c332f>
-  </documentManagement>
-</p:properties>
-</file>
-
 <file path=customXml/itemProps1.xml><?xml version="1.0" encoding="utf-8"?>
 <ds:datastoreItem xmlns:ds="http://schemas.openxmlformats.org/officeDocument/2006/customXml" ds:itemID="{EF278816-EC6F-A645-907D-7F25AECB1D4A}">
   <ds:schemaRefs>
     <ds:schemaRef ds:uri="http://schemas.openxmlformats.org/officeDocument/2006/bibliography"/>
   </ds:schemaRefs>
 </ds:datastoreItem>
-</file>
-
-<file path=customXml/itemProps2.xml><?xml version="1.0" encoding="utf-8"?>
-<ds:datastoreItem xmlns:ds="http://schemas.openxmlformats.org/officeDocument/2006/customXml" ds:itemID="{7E3BBDC7-B4BC-493E-B4F5-0E6B560CCAB2}"/>
-</file>
-
-<file path=customXml/itemProps3.xml><?xml version="1.0" encoding="utf-8"?>
-<ds:datastoreItem xmlns:ds="http://schemas.openxmlformats.org/officeDocument/2006/customXml" ds:itemID="{5E5CDE58-5395-4DCF-88D3-3372B17BDF5B}"/>
-</file>
-
-<file path=customXml/itemProps4.xml><?xml version="1.0" encoding="utf-8"?>
-<ds:datastoreItem xmlns:ds="http://schemas.openxmlformats.org/officeDocument/2006/customXml" ds:itemID="{6B4DE0AF-EFD9-4A26-90F6-AB961E10058A}"/>
 </file>
</xml_diff>